<commit_message>
Evaluación: exámenes 100% escritos en línea, sin defensa
Cada examen (parcial/final) se convierte íntegramente a sus 20 pts.
Los proyectos se entregan en línea y se evalúan dentro de Proyectos con
rúbrica de entrega; el Demo Day (sesión 10) pasa a ser showcase, no defensa.
Slides y docx del programa regenerados.
</commit_message>
<xml_diff>
--- a/programa/programa-proyectos-iii-2026.docx
+++ b/programa/programa-proyectos-iii-2026.docx
@@ -1590,7 +1590,7 @@
           <w:rFonts w:eastAsia="Arial"/>
           <w:color w:val="000000"/>
         </w:rPr>
-        <w:t>El Examen Parcial consiste en la entrega y defensa del Proyecto 1 (PWA instalable con datos); el Examen final consiste en el Demo Day: defensa del Proyecto Final (aplicación nativa) junto con el portafolio y el pitch.</w:t>
+        <w:t>Los exámenes Parcial y Final son 100 % escritos y en línea (teoría + práctica), sin defensa: los 100 puntos de cada instrumento se convierten íntegramente a los 20 puntos del examen. Los proyectos (PWA y app nativa + portafolio + pitch) se entregan en línea y se evalúan dentro de Proyectos; el Demo Day de la sesión 10 es un showcase de celebración y entrega, no una defensa calificada.</w:t>
       </w:r>
     </w:p>
     <w:p>
@@ -2642,7 +2642,7 @@
                 <w:sz w:val="22"/>
                 <w:szCs w:val="22"/>
               </w:rPr>
-              <w:t>Examen parcial (sesiones 1-4): entrega y defensa del Proyecto 1 (PWA instalable con datos)</w:t>
+              <w:t>Examen Parcial escrito en línea (sesiones 1-4): teoría + práctica escrita. Entrega en línea del Proyecto 1 (PWA instalable con datos)</w:t>
             </w:r>
           </w:p>
         </w:tc>
@@ -3496,7 +3496,7 @@
                 <w:sz w:val="22"/>
                 <w:szCs w:val="22"/>
               </w:rPr>
-              <w:t>Examen final / Demo Day (sesiones 5-8): defensa del Proyecto Final (app nativa) + portafolio + pitch</w:t>
+              <w:t>Examen Final escrito en línea (sesiones 5-9): teoría + práctica escrita. Demo Day: showcase y entrega en línea del Proyecto Final (app nativa) + portafolio + pitch</w:t>
             </w:r>
           </w:p>
         </w:tc>

</xml_diff>

<commit_message>
3ª iteración: apps reales capturadas, flujo AI Studio en guías, demos en slides, docs y fixes
- 8 apps construidas en AI Studio y capturadas (2 insignia + 6 demos); capturas de
  flujo (Build, Enable Firebase, emulador) en guias-estudiante/img/ e insertadas en guías;
  placeholders de teléfono Android eliminados; PDFs regenerados con imágenes.
- Slides: slide 'Demo del docente' por sesión + GitHub, glosario GenAI, cómo genera la IA,
  estructura de archivos/personalización manual; contraste MUTED a AA.
- Guías: GitHub/glosario/overview, personalización manual, bitácora de prompts, plantillas.
- Prompts de las 6 demos (prompts-demos-docente.md).
- Nuevos docs: especificacion-asignaciones, material-de-apoyo-links, clase-01-guion-video, plantillas.
- Evaluación: sin defensa; Proyectos=30 sin split por proyecto; quizzes barajados; rúbrica Tareas/Labs.
- Sin 'Plan B' en ningún archivo; terminología unificada a 'Demo del docente'; badges corregidos.
</commit_message>
<xml_diff>
--- a/programa/programa-proyectos-iii-2026.docx
+++ b/programa/programa-proyectos-iii-2026.docx
@@ -1608,6 +1608,24 @@
           <w:rFonts w:eastAsia="Arial"/>
           <w:color w:val="000000"/>
         </w:rPr>
+        <w:t>Los 30 puntos de Proyectos corresponden a los dos proyectos (PWA y app nativa + portafolio + pitch), que el docente reparte entre ambos; cada uno se evalúa con su rúbrica por criterio (bandas Excelente / Aceptable / Insuficiente) en sesion-05.md y sesion-10.md. Los 10 puntos de Tareas / investigaciones y los 20 de Laboratorios se distribuyen de forma equitativa entre las entregas de cada categoría; cada entrega se califica con una rúbrica breve de tres bandas (Excelente / Aceptable / Insuficiente).</w:t>
+      </w:r>
+    </w:p>
+    <w:p>
+      <w:pPr>
+        <w:numPr>
+          <w:ilvl w:val="0"/>
+          <w:numId w:val="7"/>
+        </w:numPr>
+        <w:rPr>
+          <w:color w:val="000000"/>
+        </w:rPr>
+      </w:pPr>
+      <w:r>
+        <w:rPr>
+          <w:rFonts w:eastAsia="Arial"/>
+          <w:color w:val="000000"/>
+        </w:rPr>
         <w:t>Las herramientas utilizadas (Google AI Studio y Firebase) son gratuitas y se usan desde el navegador; solo se requiere una cuenta de Google. Para probar la app nativa en un teléfono físico basta un cable USB (AI Studio la instala desde Chrome).</w:t>
       </w:r>
     </w:p>
@@ -2765,6 +2783,16 @@
                 <w:sz w:val="22"/>
                 <w:szCs w:val="22"/>
               </w:rPr>
+              <w:t>Investigación 1: Reglas de seguridad de Firebase</w:t>
+              <w:br/>
+            </w:r>
+            <w:r>
+              <w:rPr>
+                <w:rFonts w:ascii="Calibri" w:hAnsi="Calibri" w:cs="Calibri"/>
+                <w:color w:val="000000"/>
+                <w:sz w:val="22"/>
+                <w:szCs w:val="22"/>
+              </w:rPr>
               <w:t>Laboratorio 5: App nativa con login con Google y datos privados por usuario en Firestore/Storage</w:t>
             </w:r>
           </w:p>
@@ -2945,16 +2973,6 @@
                 <w:szCs w:val="22"/>
               </w:rPr>
             </w:pPr>
-            <w:r>
-              <w:rPr>
-                <w:rFonts w:ascii="Calibri" w:hAnsi="Calibri" w:cs="Calibri"/>
-                <w:color w:val="000000"/>
-                <w:sz w:val="22"/>
-                <w:szCs w:val="22"/>
-              </w:rPr>
-              <w:t>Investigación 1: Reglas de seguridad de Firebase</w:t>
-              <w:br/>
-            </w:r>
             <w:r>
               <w:rPr>
                 <w:rFonts w:ascii="Calibri" w:hAnsi="Calibri" w:cs="Calibri"/>

</xml_diff>